<commit_message>
docs(kqnodes): agrega enlace del video tutorial al manual de usuario
Inserta en el Manual de Usuario (Word) el enlace al video tutorial (19 min,
alojado en Google Drive), que cubre instalación desde cero, configuración del
entorno y una ejecución completa mostrando distintos valores de k e
interpretación de resultados.

Con esto los manuales quedan completos: sin marcadores de captura pendientes,
con todas las imágenes insertadas (Usuario: 5; Técnico: 4 diagramas UML) y el
enlace del video en su lugar.
</commit_message>
<xml_diff>
--- a/KQNodes/docs/Manual_Usuario_KQNodes.docx
+++ b/KQNodes/docs/Manual_Usuario_KQNodes.docx
@@ -2604,16 +2604,52 @@
     <w:p>
       <w:pPr>
         <w:pStyle w:val="Textodebloque"/>
-      </w:pPr>
-      <w:r>
-        <w:t xml:space="preserve">Enlace al video (8–15 min): </w:t>
-      </w:r>
-      <w:r>
         <w:rPr>
           <w:i/>
           <w:iCs/>
         </w:rPr>
-        <w:t>[pegar aquí el enlace de YouTube/Drive cuando esté listo]</w:t>
+      </w:pPr>
+      <w:r>
+        <w:t>Enlace al video (</w:t>
+      </w:r>
+      <w:r>
+        <w:t>19</w:t>
+      </w:r>
+      <w:r>
+        <w:t xml:space="preserve"> min): </w:t>
+      </w:r>
+      <w:hyperlink r:id="rId5" w:history="1">
+        <w:r>
+          <w:rPr>
+            <w:rStyle w:val="Hipervnculo"/>
+            <w:i/>
+            <w:iCs/>
+          </w:rPr>
+          <w:t>https://drive.google.com/file/d/1utRbfBA0FKUvA6z9dheD8jdmN</w:t>
+        </w:r>
+        <w:r>
+          <w:rPr>
+            <w:rStyle w:val="Hipervnculo"/>
+            <w:i/>
+            <w:iCs/>
+          </w:rPr>
+          <w:t>D</w:t>
+        </w:r>
+        <w:r>
+          <w:rPr>
+            <w:rStyle w:val="Hipervnculo"/>
+            <w:i/>
+            <w:iCs/>
+          </w:rPr>
+          <w:t>U2pTmH/view?usp=drive_link</w:t>
+        </w:r>
+      </w:hyperlink>
+      <w:r>
+        <w:rPr>
+          <w:i/>
+          <w:iCs/>
+        </w:rPr>
+        <w:t xml:space="preserve"> </w:t>
       </w:r>
     </w:p>
     <w:p>
@@ -2628,43 +2664,43 @@
       <w:pPr>
         <w:pStyle w:val="Ttulo2"/>
       </w:pPr>
-      <w:bookmarkStart w:id="0" w:name="qué-es-kqnodes-y-para-qué-sirve"/>
-      <w:bookmarkStart w:id="1" w:name="_Toc232333627"/>
+      <w:bookmarkStart w:id="0" w:name="_Toc232333627"/>
+      <w:bookmarkStart w:id="1" w:name="qué-es-kqnodes-y-para-qué-sirve"/>
       <w:r>
         <w:t>1 ¿Qué es KQNodes y para qué sirve?</w:t>
       </w:r>
-      <w:bookmarkEnd w:id="1"/>
+      <w:bookmarkEnd w:id="0"/>
     </w:p>
     <w:p>
       <w:pPr>
         <w:pStyle w:val="Ttulo3"/>
       </w:pPr>
-      <w:bookmarkStart w:id="2" w:name="el-problema-que-resuelve"/>
-      <w:bookmarkStart w:id="3" w:name="_Toc232333628"/>
+      <w:bookmarkStart w:id="2" w:name="_Toc232333628"/>
+      <w:bookmarkStart w:id="3" w:name="el-problema-que-resuelve"/>
       <w:r>
         <w:t>1.1 El problema que resuelve</w:t>
       </w:r>
+      <w:bookmarkEnd w:id="2"/>
+    </w:p>
+    <w:p>
+      <w:pPr>
+        <w:pStyle w:val="FirstParagraph"/>
+      </w:pPr>
+      <w:r>
+        <w:t>KQNodes encuentra k grupos de nodos que actúan lo más “independientes” posible entre sí. Es decir, divide una red en k subgrupos cuya interacción mutua minimiza la pérdida de información al separarlos. Analogía: imagina una orquesta; KQNodes busca agrupar instrumentos que suenan más coherentes entre sí, de modo que separar los grupos reduce lo mínimo posible la armonía general.</w:t>
+      </w:r>
+    </w:p>
+    <w:p>
+      <w:pPr>
+        <w:pStyle w:val="Ttulo3"/>
+      </w:pPr>
+      <w:bookmarkStart w:id="4" w:name="_Toc232333629"/>
+      <w:bookmarkStart w:id="5" w:name="cuándo-usar-kqnodes-vs-qnodes"/>
       <w:bookmarkEnd w:id="3"/>
-    </w:p>
-    <w:p>
-      <w:pPr>
-        <w:pStyle w:val="FirstParagraph"/>
-      </w:pPr>
-      <w:r>
-        <w:t>KQNodes encuentra k grupos de nodos que actúan lo más “independientes” posible entre sí. Es decir, divide una red en k subgrupos cuya interacción mutua minimiza la pérdida de información al separarlos. Analogía: imagina una orquesta; KQNodes busca agrupar instrumentos que suenan más coherentes entre sí, de modo que separar los grupos reduce lo mínimo posible la armonía general.</w:t>
-      </w:r>
-    </w:p>
-    <w:p>
-      <w:pPr>
-        <w:pStyle w:val="Ttulo3"/>
-      </w:pPr>
-      <w:bookmarkStart w:id="4" w:name="cuándo-usar-kqnodes-vs-qnodes"/>
-      <w:bookmarkStart w:id="5" w:name="_Toc232333629"/>
-      <w:bookmarkEnd w:id="2"/>
       <w:r>
         <w:t>1.2 Cuándo usar KQNodes vs QNodes</w:t>
       </w:r>
-      <w:bookmarkEnd w:id="5"/>
+      <w:bookmarkEnd w:id="4"/>
     </w:p>
     <w:tbl>
       <w:tblPr>
@@ -2807,13 +2843,13 @@
       <w:pPr>
         <w:pStyle w:val="Ttulo3"/>
       </w:pPr>
-      <w:bookmarkStart w:id="6" w:name="requisitos-y-cómo-instalar"/>
-      <w:bookmarkStart w:id="7" w:name="_Toc232333630"/>
-      <w:bookmarkEnd w:id="4"/>
+      <w:bookmarkStart w:id="6" w:name="_Toc232333630"/>
+      <w:bookmarkStart w:id="7" w:name="requisitos-y-cómo-instalar"/>
+      <w:bookmarkEnd w:id="5"/>
       <w:r>
         <w:t>1.3 Requisitos y cómo instalar</w:t>
       </w:r>
-      <w:bookmarkEnd w:id="7"/>
+      <w:bookmarkEnd w:id="6"/>
     </w:p>
     <w:p>
       <w:pPr>
@@ -2901,6 +2937,7 @@
         <w:rPr>
           <w:rStyle w:val="BuiltInTok"/>
         </w:rPr>
+        <w:lastRenderedPageBreak/>
         <w:t>cd</w:t>
       </w:r>
       <w:r>
@@ -2930,7 +2967,6 @@
         <w:pStyle w:val="FirstParagraph"/>
       </w:pPr>
       <w:r>
-        <w:lastRenderedPageBreak/>
         <w:t xml:space="preserve">Esto instalará las dependencias definidas en </w:t>
       </w:r>
       <w:r>
@@ -2964,6 +3000,9 @@
         <w:jc w:val="center"/>
       </w:pPr>
       <w:r>
+        <w:rPr>
+          <w:noProof/>
+        </w:rPr>
         <w:drawing>
           <wp:inline distT="0" distB="0" distL="0" distR="0" wp14:anchorId="204AA549" wp14:editId="09B6060C">
             <wp:extent cx="5612130" cy="2560320"/>
@@ -2980,7 +3019,7 @@
                     <pic:cNvPicPr/>
                   </pic:nvPicPr>
                   <pic:blipFill>
-                    <a:blip r:embed="rId5"/>
+                    <a:blip r:embed="rId6"/>
                     <a:stretch>
                       <a:fillRect/>
                     </a:stretch>
@@ -3005,10 +3044,10 @@
       <w:pPr>
         <w:pStyle w:val="Ttulo2"/>
       </w:pPr>
-      <w:bookmarkStart w:id="8" w:name="cómo-ejecutar-kqnodes"/>
-      <w:bookmarkStart w:id="9" w:name="_Toc232333631"/>
-      <w:bookmarkEnd w:id="0"/>
-      <w:bookmarkEnd w:id="6"/>
+      <w:bookmarkStart w:id="8" w:name="_Toc232333631"/>
+      <w:bookmarkStart w:id="9" w:name="cómo-ejecutar-kqnodes"/>
+      <w:bookmarkEnd w:id="1"/>
+      <w:bookmarkEnd w:id="7"/>
       <w:r>
         <w:t xml:space="preserve">2 </w:t>
       </w:r>
@@ -3024,19 +3063,19 @@
       <w:r>
         <w:t>KQNodes</w:t>
       </w:r>
-      <w:bookmarkEnd w:id="9"/>
+      <w:bookmarkEnd w:id="8"/>
       <w:proofErr w:type="spellEnd"/>
     </w:p>
     <w:p>
       <w:pPr>
         <w:pStyle w:val="Ttulo3"/>
       </w:pPr>
-      <w:bookmarkStart w:id="10" w:name="desde-la-línea-de-comandos-main.py"/>
-      <w:bookmarkStart w:id="11" w:name="_Toc232333632"/>
+      <w:bookmarkStart w:id="10" w:name="_Toc232333632"/>
+      <w:bookmarkStart w:id="11" w:name="desde-la-línea-de-comandos-main.py"/>
       <w:r>
         <w:t>2.1 Desde la línea de comandos (main.py)</w:t>
       </w:r>
-      <w:bookmarkEnd w:id="11"/>
+      <w:bookmarkEnd w:id="10"/>
     </w:p>
     <w:p>
       <w:pPr>
@@ -3417,6 +3456,9 @@
         </w:pict>
       </w:r>
       <w:r>
+        <w:rPr>
+          <w:noProof/>
+        </w:rPr>
         <w:drawing>
           <wp:inline distT="0" distB="0" distL="0" distR="0" wp14:anchorId="5A748857" wp14:editId="2E2ED799">
             <wp:extent cx="5612130" cy="2527300"/>
@@ -3433,7 +3475,7 @@
                     <pic:cNvPicPr/>
                   </pic:nvPicPr>
                   <pic:blipFill>
-                    <a:blip r:embed="rId6"/>
+                    <a:blip r:embed="rId7"/>
                     <a:stretch>
                       <a:fillRect/>
                     </a:stretch>
@@ -3454,6 +3496,9 @@
         </w:drawing>
       </w:r>
       <w:r>
+        <w:rPr>
+          <w:noProof/>
+        </w:rPr>
         <w:drawing>
           <wp:inline distT="0" distB="0" distL="0" distR="0" wp14:anchorId="1D4C5EBB" wp14:editId="00C68ED5">
             <wp:extent cx="5612130" cy="2576830"/>
@@ -3470,7 +3515,7 @@
                     <pic:cNvPicPr/>
                   </pic:nvPicPr>
                   <pic:blipFill>
-                    <a:blip r:embed="rId7"/>
+                    <a:blip r:embed="rId8"/>
                     <a:stretch>
                       <a:fillRect/>
                     </a:stretch>
@@ -3491,6 +3536,9 @@
         </w:drawing>
       </w:r>
       <w:r>
+        <w:rPr>
+          <w:noProof/>
+        </w:rPr>
         <w:drawing>
           <wp:inline distT="0" distB="0" distL="0" distR="0" wp14:anchorId="6DD53DDA" wp14:editId="71E052AE">
             <wp:extent cx="5612130" cy="2565400"/>
@@ -3507,7 +3555,7 @@
                     <pic:cNvPicPr/>
                   </pic:nvPicPr>
                   <pic:blipFill>
-                    <a:blip r:embed="rId8"/>
+                    <a:blip r:embed="rId9"/>
                     <a:stretch>
                       <a:fillRect/>
                     </a:stretch>
@@ -3532,14 +3580,14 @@
       <w:pPr>
         <w:pStyle w:val="Ttulo3"/>
       </w:pPr>
-      <w:bookmarkStart w:id="12" w:name="cómo-interpretar-la-salida"/>
-      <w:bookmarkStart w:id="13" w:name="_Toc232333633"/>
-      <w:bookmarkEnd w:id="10"/>
+      <w:bookmarkStart w:id="12" w:name="_Toc232333633"/>
+      <w:bookmarkStart w:id="13" w:name="cómo-interpretar-la-salida"/>
+      <w:bookmarkEnd w:id="11"/>
       <w:r>
         <w:lastRenderedPageBreak/>
         <w:t>2.2 Cómo interpretar la salida</w:t>
       </w:r>
-      <w:bookmarkEnd w:id="13"/>
+      <w:bookmarkEnd w:id="12"/>
     </w:p>
     <w:p>
       <w:pPr>
@@ -4125,6 +4173,9 @@
         <w:pStyle w:val="Textoindependiente"/>
       </w:pPr>
       <w:r>
+        <w:rPr>
+          <w:noProof/>
+        </w:rPr>
         <w:lastRenderedPageBreak/>
         <w:drawing>
           <wp:inline distT="0" distB="0" distL="0" distR="0" wp14:anchorId="448A3C71" wp14:editId="6641BBF7">
@@ -4142,7 +4193,7 @@
                     <pic:cNvPicPr/>
                   </pic:nvPicPr>
                   <pic:blipFill>
-                    <a:blip r:embed="rId9"/>
+                    <a:blip r:embed="rId10"/>
                     <a:stretch>
                       <a:fillRect/>
                     </a:stretch>
@@ -4167,13 +4218,13 @@
       <w:pPr>
         <w:pStyle w:val="Ttulo3"/>
       </w:pPr>
-      <w:bookmarkStart w:id="14" w:name="X2194ec5e1781feba4af7d6078289f41e9ea2fd4"/>
-      <w:bookmarkStart w:id="15" w:name="_Toc232333634"/>
-      <w:bookmarkEnd w:id="12"/>
+      <w:bookmarkStart w:id="14" w:name="_Toc232333634"/>
+      <w:bookmarkStart w:id="15" w:name="X2194ec5e1781feba4af7d6078289f41e9ea2fd4"/>
+      <w:bookmarkEnd w:id="13"/>
       <w:r>
         <w:t>2.3 Volcado masivo al Excel (fill_excel_kqnodes.py)</w:t>
       </w:r>
-      <w:bookmarkEnd w:id="15"/>
+      <w:bookmarkEnd w:id="14"/>
     </w:p>
     <w:p>
       <w:pPr>
@@ -4226,7 +4277,7 @@
       <w:r>
         <w:t xml:space="preserve">Antes de ejecutar, edita las constantes al inicio de </w:t>
       </w:r>
-      <w:hyperlink r:id="rId10">
+      <w:hyperlink r:id="rId11">
         <w:r>
           <w:rPr>
             <w:rStyle w:val="Hipervnculo"/>
@@ -4500,25 +4551,25 @@
       <w:pPr>
         <w:pStyle w:val="Ttulo2"/>
       </w:pPr>
-      <w:bookmarkStart w:id="16" w:name="interpretar-y-ajustar-resultados"/>
-      <w:bookmarkStart w:id="17" w:name="_Toc232333635"/>
-      <w:bookmarkEnd w:id="8"/>
-      <w:bookmarkEnd w:id="14"/>
+      <w:bookmarkStart w:id="16" w:name="_Toc232333635"/>
+      <w:bookmarkStart w:id="17" w:name="interpretar-y-ajustar-resultados"/>
+      <w:bookmarkEnd w:id="9"/>
+      <w:bookmarkEnd w:id="15"/>
       <w:r>
         <w:t>3 Interpretar y Ajustar Resultados</w:t>
       </w:r>
-      <w:bookmarkEnd w:id="17"/>
+      <w:bookmarkEnd w:id="16"/>
     </w:p>
     <w:p>
       <w:pPr>
         <w:pStyle w:val="Ttulo3"/>
       </w:pPr>
-      <w:bookmarkStart w:id="18" w:name="diagnóstico-rápido-tabla-de-síntomas"/>
-      <w:bookmarkStart w:id="19" w:name="_Toc232333636"/>
+      <w:bookmarkStart w:id="18" w:name="_Toc232333636"/>
+      <w:bookmarkStart w:id="19" w:name="diagnóstico-rápido-tabla-de-síntomas"/>
       <w:r>
         <w:t>3.1 Diagnóstico rápido: tabla de síntomas</w:t>
       </w:r>
-      <w:bookmarkEnd w:id="19"/>
+      <w:bookmarkEnd w:id="18"/>
     </w:p>
     <w:tbl>
       <w:tblPr>
@@ -4746,13 +4797,13 @@
       <w:pPr>
         <w:pStyle w:val="Ttulo3"/>
       </w:pPr>
-      <w:bookmarkStart w:id="20" w:name="parámetros-de-ajuste"/>
-      <w:bookmarkStart w:id="21" w:name="_Toc232333637"/>
-      <w:bookmarkEnd w:id="18"/>
+      <w:bookmarkStart w:id="20" w:name="_Toc232333637"/>
+      <w:bookmarkStart w:id="21" w:name="parámetros-de-ajuste"/>
+      <w:bookmarkEnd w:id="19"/>
       <w:r>
         <w:t>3.2 Parámetros de ajuste</w:t>
       </w:r>
-      <w:bookmarkEnd w:id="21"/>
+      <w:bookmarkEnd w:id="20"/>
     </w:p>
     <w:p>
       <w:pPr>
@@ -4900,13 +4951,13 @@
       <w:pPr>
         <w:pStyle w:val="Ttulo3"/>
       </w:pPr>
-      <w:bookmarkStart w:id="22" w:name="X4573cce43ef330f17b4fe153c0967e58dc571fe"/>
-      <w:bookmarkStart w:id="23" w:name="_Toc232333638"/>
-      <w:bookmarkEnd w:id="20"/>
+      <w:bookmarkStart w:id="22" w:name="_Toc232333638"/>
+      <w:bookmarkStart w:id="23" w:name="X4573cce43ef330f17b4fe153c0967e58dc571fe"/>
+      <w:bookmarkEnd w:id="21"/>
       <w:r>
         <w:t>3.3 Comparación lado a lado: KQNodes vs QNodes</w:t>
       </w:r>
-      <w:bookmarkEnd w:id="23"/>
+      <w:bookmarkEnd w:id="22"/>
     </w:p>
     <w:p>
       <w:pPr>
@@ -5670,13 +5721,13 @@
       <w:pPr>
         <w:pStyle w:val="Ttulo3"/>
       </w:pPr>
-      <w:bookmarkStart w:id="24" w:name="X277e92756c13a728273afb689cb20274a1fd451"/>
-      <w:bookmarkStart w:id="25" w:name="_Toc232333639"/>
-      <w:bookmarkEnd w:id="22"/>
+      <w:bookmarkStart w:id="24" w:name="_Toc232333639"/>
+      <w:bookmarkStart w:id="25" w:name="X277e92756c13a728273afb689cb20274a1fd451"/>
+      <w:bookmarkEnd w:id="23"/>
       <w:r>
         <w:t>3.4 Observación: φ(k=3) &gt; φ(k=2) es matemáticamente válido</w:t>
       </w:r>
-      <w:bookmarkEnd w:id="25"/>
+      <w:bookmarkEnd w:id="24"/>
     </w:p>
     <w:p>
       <w:pPr>
@@ -5966,13 +6017,13 @@
       <w:pPr>
         <w:pStyle w:val="Ttulo3"/>
       </w:pPr>
-      <w:bookmarkStart w:id="26" w:name="Xe287c789140c903e4eb0cbc630b441ddaa804d6"/>
-      <w:bookmarkStart w:id="27" w:name="_Toc232333640"/>
-      <w:bookmarkEnd w:id="24"/>
+      <w:bookmarkStart w:id="26" w:name="_Toc232333640"/>
+      <w:bookmarkStart w:id="27" w:name="Xe287c789140c903e4eb0cbc630b441ddaa804d6"/>
+      <w:bookmarkEnd w:id="25"/>
       <w:r>
         <w:t>3.5 ¿Por qué KQNodes con k=2 no siempre da el mismo resultado que QNodes?</w:t>
       </w:r>
-      <w:bookmarkEnd w:id="27"/>
+      <w:bookmarkEnd w:id="26"/>
     </w:p>
     <w:p>
       <w:pPr>
@@ -6321,25 +6372,25 @@
       <w:pPr>
         <w:pStyle w:val="Ttulo2"/>
       </w:pPr>
-      <w:bookmarkStart w:id="28" w:name="preguntas-frecuentes-y-ejemplos"/>
-      <w:bookmarkStart w:id="29" w:name="_Toc232333641"/>
-      <w:bookmarkEnd w:id="16"/>
-      <w:bookmarkEnd w:id="26"/>
+      <w:bookmarkStart w:id="28" w:name="_Toc232333641"/>
+      <w:bookmarkStart w:id="29" w:name="preguntas-frecuentes-y-ejemplos"/>
+      <w:bookmarkEnd w:id="17"/>
+      <w:bookmarkEnd w:id="27"/>
       <w:r>
         <w:t>4 Preguntas Frecuentes y Ejemplos</w:t>
       </w:r>
-      <w:bookmarkEnd w:id="29"/>
+      <w:bookmarkEnd w:id="28"/>
     </w:p>
     <w:p>
       <w:pPr>
         <w:pStyle w:val="Ttulo3"/>
       </w:pPr>
-      <w:bookmarkStart w:id="30" w:name="faq"/>
-      <w:bookmarkStart w:id="31" w:name="_Toc232333642"/>
+      <w:bookmarkStart w:id="30" w:name="_Toc232333642"/>
+      <w:bookmarkStart w:id="31" w:name="faq"/>
       <w:r>
         <w:t>4.1 FAQ</w:t>
       </w:r>
-      <w:bookmarkEnd w:id="31"/>
+      <w:bookmarkEnd w:id="30"/>
     </w:p>
     <w:p>
       <w:pPr>
@@ -6594,13 +6645,13 @@
       <w:pPr>
         <w:pStyle w:val="Ttulo3"/>
       </w:pPr>
-      <w:bookmarkStart w:id="32" w:name="ejemplo-diagrama-ascii"/>
-      <w:bookmarkStart w:id="33" w:name="_Toc232333643"/>
-      <w:bookmarkEnd w:id="30"/>
+      <w:bookmarkStart w:id="32" w:name="_Toc232333643"/>
+      <w:bookmarkStart w:id="33" w:name="ejemplo-diagrama-ascii"/>
+      <w:bookmarkEnd w:id="31"/>
       <w:r>
         <w:t>4.2 Ejemplo (diagrama ASCII)</w:t>
       </w:r>
-      <w:bookmarkEnd w:id="33"/>
+      <w:bookmarkEnd w:id="32"/>
     </w:p>
     <w:p>
       <w:pPr>
@@ -6662,13 +6713,13 @@
       <w:pPr>
         <w:pStyle w:val="Ttulo3"/>
       </w:pPr>
-      <w:bookmarkStart w:id="34" w:name="enlaces-útiles"/>
-      <w:bookmarkStart w:id="35" w:name="_Toc232333644"/>
-      <w:bookmarkEnd w:id="32"/>
+      <w:bookmarkStart w:id="34" w:name="_Toc232333644"/>
+      <w:bookmarkStart w:id="35" w:name="enlaces-útiles"/>
+      <w:bookmarkEnd w:id="33"/>
       <w:r>
         <w:t>4.3 Enlaces útiles</w:t>
       </w:r>
-      <w:bookmarkEnd w:id="35"/>
+      <w:bookmarkEnd w:id="34"/>
     </w:p>
     <w:p>
       <w:pPr>
@@ -6725,14 +6776,14 @@
       <w:pPr>
         <w:pStyle w:val="Ttulo2"/>
       </w:pPr>
-      <w:bookmarkStart w:id="36" w:name="Xda2d6b35cbc2da7cdc5a1d5d2ed452e4436b278"/>
-      <w:bookmarkStart w:id="37" w:name="_Toc232333645"/>
-      <w:bookmarkEnd w:id="28"/>
-      <w:bookmarkEnd w:id="34"/>
+      <w:bookmarkStart w:id="36" w:name="_Toc232333645"/>
+      <w:bookmarkStart w:id="37" w:name="Xda2d6b35cbc2da7cdc5a1d5d2ed452e4436b278"/>
+      <w:bookmarkEnd w:id="29"/>
+      <w:bookmarkEnd w:id="35"/>
       <w:r>
         <w:t>Anexo A — Optimizaciones de rendimiento en QNodes (base de KQNodes)</w:t>
       </w:r>
-      <w:bookmarkEnd w:id="37"/>
+      <w:bookmarkEnd w:id="36"/>
     </w:p>
     <w:p>
       <w:pPr>
@@ -6764,12 +6815,12 @@
       <w:pPr>
         <w:pStyle w:val="Ttulo3"/>
       </w:pPr>
-      <w:bookmarkStart w:id="38" w:name="a.1-conversión-float64-float32"/>
-      <w:bookmarkStart w:id="39" w:name="_Toc232333646"/>
+      <w:bookmarkStart w:id="38" w:name="_Toc232333646"/>
+      <w:bookmarkStart w:id="39" w:name="a.1-conversión-float64-float32"/>
       <w:r>
         <w:t>A.1 Conversión float64 → float32</w:t>
       </w:r>
-      <w:bookmarkEnd w:id="39"/>
+      <w:bookmarkEnd w:id="38"/>
     </w:p>
     <w:p>
       <w:pPr>
@@ -6934,13 +6985,13 @@
       <w:pPr>
         <w:pStyle w:val="Ttulo3"/>
       </w:pPr>
-      <w:bookmarkStart w:id="40" w:name="X659983b71fb41f09df0168ae3895551b6024537"/>
-      <w:bookmarkStart w:id="41" w:name="_Toc232333647"/>
-      <w:bookmarkEnd w:id="38"/>
+      <w:bookmarkStart w:id="40" w:name="_Toc232333647"/>
+      <w:bookmarkStart w:id="41" w:name="X659983b71fb41f09df0168ae3895551b6024537"/>
+      <w:bookmarkEnd w:id="39"/>
       <w:r>
         <w:t>A.2 Caché de distribución marginal de uniones</w:t>
       </w:r>
-      <w:bookmarkEnd w:id="41"/>
+      <w:bookmarkEnd w:id="40"/>
     </w:p>
     <w:p>
       <w:pPr>
@@ -7082,14 +7133,14 @@
       <w:pPr>
         <w:pStyle w:val="Ttulo3"/>
       </w:pPr>
-      <w:bookmarkStart w:id="42" w:name="Xe027fc1b00e2ed616925315e04865b08868d884"/>
-      <w:bookmarkStart w:id="43" w:name="_Toc232333648"/>
-      <w:bookmarkEnd w:id="40"/>
+      <w:bookmarkStart w:id="42" w:name="_Toc232333648"/>
+      <w:bookmarkStart w:id="43" w:name="Xe027fc1b00e2ed616925315e04865b08868d884"/>
+      <w:bookmarkEnd w:id="41"/>
       <w:r>
         <w:lastRenderedPageBreak/>
         <w:t>A.3 Ejecución paralela en el script de volcado</w:t>
       </w:r>
-      <w:bookmarkEnd w:id="43"/>
+      <w:bookmarkEnd w:id="42"/>
     </w:p>
     <w:p>
       <w:pPr>
@@ -7176,13 +7227,13 @@
       <w:pPr>
         <w:pStyle w:val="Ttulo3"/>
       </w:pPr>
-      <w:bookmarkStart w:id="44" w:name="Xc61688a09ad91ca0b1e2acc46b3bafec6e61367"/>
-      <w:bookmarkStart w:id="45" w:name="_Toc232333649"/>
-      <w:bookmarkEnd w:id="42"/>
+      <w:bookmarkStart w:id="44" w:name="_Toc232333649"/>
+      <w:bookmarkStart w:id="45" w:name="Xc61688a09ad91ca0b1e2acc46b3bafec6e61367"/>
+      <w:bookmarkEnd w:id="43"/>
       <w:r>
         <w:t>A.4 Estimado de tiempo para N=20 (AMD 3020e, 2 núcleos, 1.2 GHz)</w:t>
       </w:r>
-      <w:bookmarkEnd w:id="45"/>
+      <w:bookmarkEnd w:id="44"/>
     </w:p>
     <w:tbl>
       <w:tblPr>
@@ -7384,14 +7435,14 @@
       <w:pPr>
         <w:pStyle w:val="Ttulo2"/>
       </w:pPr>
-      <w:bookmarkStart w:id="46" w:name="Xe77ddaa0baf58d1ec6961f695deeeedf6c7ae50"/>
-      <w:bookmarkStart w:id="47" w:name="_Toc232333650"/>
-      <w:bookmarkEnd w:id="36"/>
-      <w:bookmarkEnd w:id="44"/>
+      <w:bookmarkStart w:id="46" w:name="_Toc232333650"/>
+      <w:bookmarkStart w:id="47" w:name="Xe77ddaa0baf58d1ec6961f695deeeedf6c7ae50"/>
+      <w:bookmarkEnd w:id="37"/>
+      <w:bookmarkEnd w:id="45"/>
       <w:r>
         <w:t>Anexo B — Optimizaciones de rendimiento en GeoMIP</w:t>
       </w:r>
-      <w:bookmarkEnd w:id="47"/>
+      <w:bookmarkEnd w:id="46"/>
     </w:p>
     <w:p>
       <w:pPr>
@@ -7405,12 +7456,12 @@
       <w:pPr>
         <w:pStyle w:val="Ttulo3"/>
       </w:pPr>
-      <w:bookmarkStart w:id="48" w:name="b.1-eliminación-de-prints-de-depuración"/>
-      <w:bookmarkStart w:id="49" w:name="_Toc232333651"/>
+      <w:bookmarkStart w:id="48" w:name="_Toc232333651"/>
+      <w:bookmarkStart w:id="49" w:name="b.1-eliminación-de-prints-de-depuración"/>
       <w:r>
         <w:t>B.1 Eliminación de prints de depuración</w:t>
       </w:r>
-      <w:bookmarkEnd w:id="49"/>
+      <w:bookmarkEnd w:id="48"/>
     </w:p>
     <w:p>
       <w:pPr>
@@ -7461,146 +7512,146 @@
       <w:pPr>
         <w:pStyle w:val="Ttulo3"/>
       </w:pPr>
-      <w:bookmarkStart w:id="50" w:name="b.2-conversión-float64-float32"/>
-      <w:bookmarkStart w:id="51" w:name="_Toc232333652"/>
-      <w:bookmarkEnd w:id="48"/>
+      <w:bookmarkStart w:id="50" w:name="_Toc232333652"/>
+      <w:bookmarkStart w:id="51" w:name="b.2-conversión-float64-float32"/>
+      <w:bookmarkEnd w:id="49"/>
       <w:r>
         <w:t>B.2 Conversión float64 → float32</w:t>
       </w:r>
+      <w:bookmarkEnd w:id="50"/>
+    </w:p>
+    <w:p>
+      <w:pPr>
+        <w:pStyle w:val="FirstParagraph"/>
+      </w:pPr>
+      <w:r>
+        <w:t xml:space="preserve">Igual que en QNodes: al crear los n-cubos en </w:t>
+      </w:r>
+      <w:r>
+        <w:rPr>
+          <w:rStyle w:val="VerbatimChar"/>
+        </w:rPr>
+        <w:t>System.__init__</w:t>
+      </w:r>
+      <w:r>
+        <w:t xml:space="preserve"> se aplica </w:t>
+      </w:r>
+      <w:r>
+        <w:rPr>
+          <w:rStyle w:val="VerbatimChar"/>
+        </w:rPr>
+        <w:t>.astype(np.float32, copy=False)</w:t>
+      </w:r>
+      <w:r>
+        <w:t>. El impacto es idéntico — mitad de memoria y hasta 2× más velocidad en las operaciones de marginalización que utilizan instrucciones SIMD del procesador.</w:t>
+      </w:r>
+    </w:p>
+    <w:p>
+      <w:pPr>
+        <w:pStyle w:val="Ttulo3"/>
+      </w:pPr>
+      <w:bookmarkStart w:id="52" w:name="_Toc232333653"/>
+      <w:bookmarkStart w:id="53" w:name="b.3-conversión-estadoíndice-sin-strings"/>
       <w:bookmarkEnd w:id="51"/>
-    </w:p>
-    <w:p>
-      <w:pPr>
-        <w:pStyle w:val="FirstParagraph"/>
-      </w:pPr>
-      <w:r>
-        <w:t xml:space="preserve">Igual que en QNodes: al crear los n-cubos en </w:t>
-      </w:r>
-      <w:r>
-        <w:rPr>
-          <w:rStyle w:val="VerbatimChar"/>
-        </w:rPr>
-        <w:t>System.__init__</w:t>
-      </w:r>
-      <w:r>
-        <w:t xml:space="preserve"> se aplica </w:t>
-      </w:r>
-      <w:r>
-        <w:rPr>
-          <w:rStyle w:val="VerbatimChar"/>
-        </w:rPr>
-        <w:t>.astype(np.float32, copy=False)</w:t>
-      </w:r>
-      <w:r>
-        <w:t>. El impacto es idéntico — mitad de memoria y hasta 2× más velocidad en las operaciones de marginalización que utilizan instrucciones SIMD del procesador.</w:t>
-      </w:r>
-    </w:p>
-    <w:p>
-      <w:pPr>
-        <w:pStyle w:val="Ttulo3"/>
-      </w:pPr>
-      <w:bookmarkStart w:id="52" w:name="b.3-conversión-estadoíndice-sin-strings"/>
-      <w:bookmarkStart w:id="53" w:name="_Toc232333653"/>
-      <w:bookmarkEnd w:id="50"/>
       <w:r>
         <w:lastRenderedPageBreak/>
         <w:t>B.3 Conversión estado→índice sin strings</w:t>
       </w:r>
+      <w:bookmarkEnd w:id="52"/>
+    </w:p>
+    <w:p>
+      <w:pPr>
+        <w:pStyle w:val="FirstParagraph"/>
+      </w:pPr>
+      <w:r>
+        <w:t xml:space="preserve">Antes, convertir un estado binario (lista de 0s y 1s) a un índice entero usaba </w:t>
+      </w:r>
+      <w:r>
+        <w:rPr>
+          <w:rStyle w:val="VerbatimChar"/>
+        </w:rPr>
+        <w:t>int("".join(map(str, estado[::-1])), 2)</w:t>
+      </w:r>
+      <w:r>
+        <w:t xml:space="preserve"> — una operación de cadena de caracteres ejecutada ~2^N veces. Se reemplazó por </w:t>
+      </w:r>
+      <w:r>
+        <w:rPr>
+          <w:rStyle w:val="VerbatimChar"/>
+        </w:rPr>
+        <w:t>np.dot(estado, 2**np.arange(N))</w:t>
+      </w:r>
+      <w:r>
+        <w:t>, un producto escalar entero equivalente que NumPy ejecuta de forma vectorizada sin construir strings intermedios.</w:t>
+      </w:r>
+    </w:p>
+    <w:p>
+      <w:pPr>
+        <w:pStyle w:val="Ttulo3"/>
+      </w:pPr>
+      <w:bookmarkStart w:id="54" w:name="_Toc232333654"/>
+      <w:bookmarkStart w:id="55" w:name="X871232d75988593ffd32d403655dc98cf27136b"/>
       <w:bookmarkEnd w:id="53"/>
+      <w:r>
+        <w:t>B.4 Tabla de transiciones con arrays NumPy</w:t>
+      </w:r>
+      <w:bookmarkEnd w:id="54"/>
     </w:p>
     <w:p>
       <w:pPr>
         <w:pStyle w:val="FirstParagraph"/>
       </w:pPr>
       <w:r>
-        <w:t xml:space="preserve">Antes, convertir un estado binario (lista de 0s y 1s) a un índice entero usaba </w:t>
-      </w:r>
-      <w:r>
-        <w:rPr>
-          <w:rStyle w:val="VerbatimChar"/>
-        </w:rPr>
-        <w:t>int("".join(map(str, estado[::-1])), 2)</w:t>
-      </w:r>
-      <w:r>
-        <w:t xml:space="preserve"> — una operación de cadena de caracteres ejecutada ~2^N veces. Se reemplazó por </w:t>
-      </w:r>
-      <w:r>
-        <w:rPr>
-          <w:rStyle w:val="VerbatimChar"/>
-        </w:rPr>
-        <w:t>np.dot(estado, 2**np.arange(N))</w:t>
-      </w:r>
-      <w:r>
-        <w:t>, un producto escalar entero equivalente que NumPy ejecuta de forma vectorizada sin construir strings intermedios.</w:t>
+        <w:t xml:space="preserve">Los valores almacenados en la tabla pasaron de listas Python a arrays </w:t>
+      </w:r>
+      <w:r>
+        <w:rPr>
+          <w:rStyle w:val="VerbatimChar"/>
+        </w:rPr>
+        <w:t>np.ndarray</w:t>
+      </w:r>
+      <w:r>
+        <w:t>. Esto convirtió la acumulación de costos entre niveles de Hamming (</w:t>
+      </w:r>
+      <w:r>
+        <w:rPr>
+          <w:rStyle w:val="VerbatimChar"/>
+        </w:rPr>
+        <w:t>diffs + tabla[temp_key]</w:t>
+      </w:r>
+      <w:r>
+        <w:t>) y la multiplicación por el factor de decrecimiento (</w:t>
+      </w:r>
+      <w:r>
+        <w:rPr>
+          <w:rStyle w:val="VerbatimChar"/>
+        </w:rPr>
+        <w:t>diffs * factor</w:t>
+      </w:r>
+      <w:r>
+        <w:t xml:space="preserve">) en operaciones vectorizadas de NumPy, eliminando los loops </w:t>
+      </w:r>
+      <w:r>
+        <w:rPr>
+          <w:rStyle w:val="VerbatimChar"/>
+        </w:rPr>
+        <w:t>for n in ncubos</w:t>
+      </w:r>
+      <w:r>
+        <w:t xml:space="preserve"> que procesaban elemento a elemento.</w:t>
       </w:r>
     </w:p>
     <w:p>
       <w:pPr>
         <w:pStyle w:val="Ttulo3"/>
       </w:pPr>
-      <w:bookmarkStart w:id="54" w:name="X871232d75988593ffd32d403655dc98cf27136b"/>
-      <w:bookmarkStart w:id="55" w:name="_Toc232333654"/>
-      <w:bookmarkEnd w:id="52"/>
-      <w:r>
-        <w:t>B.4 Tabla de transiciones con arrays NumPy</w:t>
-      </w:r>
+      <w:bookmarkStart w:id="56" w:name="_Toc232333655"/>
+      <w:bookmarkStart w:id="57" w:name="X8d52110a7fa13a2e79be99eef8dbcc0a4097488"/>
       <w:bookmarkEnd w:id="55"/>
-    </w:p>
-    <w:p>
-      <w:pPr>
-        <w:pStyle w:val="FirstParagraph"/>
-      </w:pPr>
-      <w:r>
-        <w:t xml:space="preserve">Los valores almacenados en la tabla pasaron de listas Python a arrays </w:t>
-      </w:r>
-      <w:r>
-        <w:rPr>
-          <w:rStyle w:val="VerbatimChar"/>
-        </w:rPr>
-        <w:t>np.ndarray</w:t>
-      </w:r>
-      <w:r>
-        <w:t>. Esto convirtió la acumulación de costos entre niveles de Hamming (</w:t>
-      </w:r>
-      <w:r>
-        <w:rPr>
-          <w:rStyle w:val="VerbatimChar"/>
-        </w:rPr>
-        <w:t>diffs + tabla[temp_key]</w:t>
-      </w:r>
-      <w:r>
-        <w:t>) y la multiplicación por el factor de decrecimiento (</w:t>
-      </w:r>
-      <w:r>
-        <w:rPr>
-          <w:rStyle w:val="VerbatimChar"/>
-        </w:rPr>
-        <w:t>diffs * factor</w:t>
-      </w:r>
-      <w:r>
-        <w:t xml:space="preserve">) en operaciones vectorizadas de NumPy, eliminando los loops </w:t>
-      </w:r>
-      <w:r>
-        <w:rPr>
-          <w:rStyle w:val="VerbatimChar"/>
-        </w:rPr>
-        <w:t>for n in ncubos</w:t>
-      </w:r>
-      <w:r>
-        <w:t xml:space="preserve"> que procesaban elemento a elemento.</w:t>
-      </w:r>
-    </w:p>
-    <w:p>
-      <w:pPr>
-        <w:pStyle w:val="Ttulo3"/>
-      </w:pPr>
-      <w:bookmarkStart w:id="56" w:name="X8d52110a7fa13a2e79be99eef8dbcc0a4097488"/>
-      <w:bookmarkStart w:id="57" w:name="_Toc232333655"/>
-      <w:bookmarkEnd w:id="54"/>
       <w:r>
         <w:t>B.5 Script paralelo con kill-on-timeout garantizado</w:t>
       </w:r>
-      <w:bookmarkEnd w:id="57"/>
+      <w:bookmarkEnd w:id="56"/>
     </w:p>
     <w:p>
       <w:pPr>
@@ -7719,13 +7770,13 @@
       <w:pPr>
         <w:pStyle w:val="Ttulo3"/>
       </w:pPr>
-      <w:bookmarkStart w:id="58" w:name="Xf883ab2c15e68cdaecdc808ed320e7e361f12ee"/>
-      <w:bookmarkStart w:id="59" w:name="_Toc232333656"/>
-      <w:bookmarkEnd w:id="56"/>
+      <w:bookmarkStart w:id="58" w:name="_Toc232333656"/>
+      <w:bookmarkStart w:id="59" w:name="Xf883ab2c15e68cdaecdc808ed320e7e361f12ee"/>
+      <w:bookmarkEnd w:id="57"/>
       <w:r>
         <w:t>B.6 Estimado de tiempo (AMD 3020e, 2 núcleos, 1.2 GHz)</w:t>
       </w:r>
-      <w:bookmarkEnd w:id="59"/>
+      <w:bookmarkEnd w:id="58"/>
     </w:p>
     <w:tbl>
       <w:tblPr>
@@ -7935,14 +7986,14 @@
       <w:pPr>
         <w:pStyle w:val="Ttulo2"/>
       </w:pPr>
-      <w:bookmarkStart w:id="60" w:name="Xd88e275ac02f388efe4c0fe4ecaa56f36cbacaf"/>
-      <w:bookmarkStart w:id="61" w:name="_Toc232333657"/>
-      <w:bookmarkEnd w:id="46"/>
-      <w:bookmarkEnd w:id="58"/>
+      <w:bookmarkStart w:id="60" w:name="_Toc232333657"/>
+      <w:bookmarkStart w:id="61" w:name="Xd88e275ac02f388efe4c0fe4ecaa56f36cbacaf"/>
+      <w:bookmarkEnd w:id="47"/>
+      <w:bookmarkEnd w:id="59"/>
       <w:r>
         <w:t>Anexo C — Optimizaciones de rendimiento en KQNodes</w:t>
       </w:r>
-      <w:bookmarkEnd w:id="61"/>
+      <w:bookmarkEnd w:id="60"/>
     </w:p>
     <w:p>
       <w:pPr>
@@ -7956,29 +8007,93 @@
       <w:pPr>
         <w:pStyle w:val="Ttulo3"/>
       </w:pPr>
-      <w:bookmarkStart w:id="62" w:name="Xeb45bdcc2788add21a50175a6dab701cf5fcdf8"/>
-      <w:bookmarkStart w:id="63" w:name="_Toc232333658"/>
+      <w:bookmarkStart w:id="62" w:name="_Toc232333658"/>
+      <w:bookmarkStart w:id="63" w:name="Xeb45bdcc2788add21a50175a6dab701cf5fcdf8"/>
       <w:r>
         <w:lastRenderedPageBreak/>
         <w:t>C.1 Cache de distribuciones marginales (K1)</w:t>
       </w:r>
+      <w:bookmarkEnd w:id="62"/>
+    </w:p>
+    <w:p>
+      <w:pPr>
+        <w:pStyle w:val="FirstParagraph"/>
+      </w:pPr>
+      <w:r>
+        <w:t xml:space="preserve">La distribución marginal de un conjunto de nodos (llamada </w:t>
+      </w:r>
+      <w:r>
+        <w:rPr>
+          <w:rStyle w:val="VerbatimChar"/>
+        </w:rPr>
+        <w:t>substraer + distribucion_marginal</w:t>
+      </w:r>
+      <w:r>
+        <w:t>) depende únicamente de qué nodos componen esa parte — no de cuándo ni desde qué contexto se consulta. Sin embargo, las partes ya fijadas en iteraciones anteriores de Queyranne aparecían en cada una de las cientos de evaluaciones de la fase siguiente, recalculando siempre el mismo resultado.</w:t>
+      </w:r>
+    </w:p>
+    <w:p>
+      <w:pPr>
+        <w:pStyle w:val="Textoindependiente"/>
+      </w:pPr>
+      <w:r>
+        <w:t xml:space="preserve">Se añadió un diccionario </w:t>
+      </w:r>
+      <w:r>
+        <w:rPr>
+          <w:rStyle w:val="VerbatimChar"/>
+        </w:rPr>
+        <w:t>_memo_marginal</w:t>
+      </w:r>
+      <w:r>
+        <w:t xml:space="preserve"> que guarda el resultado la primera vez que se calcula para un conjunto de nodos y lo reutiliza en todas las llamadas siguientes. El cache se limpia al comenzar cada caso nuevo, por lo que no hay riesgo de mezclar resultados entre casos distintos.</w:t>
+      </w:r>
+    </w:p>
+    <w:p>
+      <w:pPr>
+        <w:pStyle w:val="Ttulo3"/>
+      </w:pPr>
+      <w:bookmarkStart w:id="64" w:name="_Toc232333659"/>
+      <w:bookmarkStart w:id="65" w:name="Xfb52e5d61cda7d94a5d25836b0471c5a2c43112"/>
       <w:bookmarkEnd w:id="63"/>
+      <w:r>
+        <w:t>C.2 Evaluación invariante en el loop de Queyranne (K2)</w:t>
+      </w:r>
+      <w:bookmarkEnd w:id="64"/>
     </w:p>
     <w:p>
       <w:pPr>
         <w:pStyle w:val="FirstParagraph"/>
       </w:pPr>
       <w:r>
-        <w:t xml:space="preserve">La distribución marginal de un conjunto de nodos (llamada </w:t>
-      </w:r>
-      <w:r>
-        <w:rPr>
-          <w:rStyle w:val="VerbatimChar"/>
-        </w:rPr>
-        <w:t>substraer + distribucion_marginal</w:t>
-      </w:r>
-      <w:r>
-        <w:t>) depende únicamente de qué nodos componen esa parte — no de cuándo ni desde qué contexto se consulta. Sin embargo, las partes ya fijadas en iteraciones anteriores de Queyranne aparecían en cada una de las cientos de evaluaciones de la fase siguiente, recalculando siempre el mismo resultado.</w:t>
+        <w:t xml:space="preserve">El algoritmo de Queyranne construye una secuencia eligiendo, paso a paso, el bloque de mayor ganancia marginal. La ganancia se calcula como </w:t>
+      </w:r>
+      <w:r>
+        <w:rPr>
+          <w:rStyle w:val="VerbatimChar"/>
+        </w:rPr>
+        <w:t>f(S ∪ a) − f(S)</w:t>
+      </w:r>
+      <w:r>
+        <w:t xml:space="preserve">. El valor </w:t>
+      </w:r>
+      <w:r>
+        <w:rPr>
+          <w:rStyle w:val="VerbatimChar"/>
+        </w:rPr>
+        <w:t>f(S)</w:t>
+      </w:r>
+      <w:r>
+        <w:t xml:space="preserve"> es constante dentro del loop que prueba todos los bloques candidatos </w:t>
+      </w:r>
+      <w:r>
+        <w:rPr>
+          <w:rStyle w:val="VerbatimChar"/>
+        </w:rPr>
+        <w:t>a</w:t>
+      </w:r>
+      <w:r>
+        <w:t>, pero antes se recomputaba para cada candidato.</w:t>
       </w:r>
     </w:p>
     <w:p>
@@ -7986,136 +8101,72 @@
         <w:pStyle w:val="Textoindependiente"/>
       </w:pPr>
       <w:r>
+        <w:t xml:space="preserve">Con este cambio, </w:t>
+      </w:r>
+      <w:r>
+        <w:rPr>
+          <w:rStyle w:val="VerbatimChar"/>
+        </w:rPr>
+        <w:t>f(S)</w:t>
+      </w:r>
+      <w:r>
+        <w:t xml:space="preserve"> se calcula una sola vez antes del loop interno. Para un subsistema de 15 nodos, esto elimina ~105 evaluaciones redundantes por fase.</w:t>
+      </w:r>
+    </w:p>
+    <w:p>
+      <w:pPr>
+        <w:pStyle w:val="Ttulo3"/>
+      </w:pPr>
+      <w:bookmarkStart w:id="66" w:name="_Toc232333660"/>
+      <w:bookmarkStart w:id="67" w:name="c.3-cache-de-pérdida-final-k3"/>
+      <w:bookmarkEnd w:id="65"/>
+      <w:r>
+        <w:t>C.3 Cache de pérdida final (K3)</w:t>
+      </w:r>
+      <w:bookmarkEnd w:id="66"/>
+    </w:p>
+    <w:p>
+      <w:pPr>
+        <w:pStyle w:val="FirstParagraph"/>
+      </w:pPr>
+      <w:r>
+        <w:rPr>
+          <w:rStyle w:val="VerbatimChar"/>
+        </w:rPr>
+        <w:t>_calcular_perdida_final</w:t>
+      </w:r>
+      <w:r>
+        <w:t xml:space="preserve"> calcula la pérdida EMD de una k-partición completa. Se llama repetidamente en el refinamiento divisivo y en el hill climbing. En particular, cuando el hill climbing converge (ningún movimiento mejora), evalúa todas las combinaciones posibles sin encontrar ninguna mejor — la mayoría de esas particiones candidatas ya habían sido evaluadas en iteraciones anteriores.</w:t>
+      </w:r>
+    </w:p>
+    <w:p>
+      <w:pPr>
+        <w:pStyle w:val="Textoindependiente"/>
+      </w:pPr>
+      <w:r>
         <w:t xml:space="preserve">Se añadió un diccionario </w:t>
       </w:r>
       <w:r>
         <w:rPr>
           <w:rStyle w:val="VerbatimChar"/>
         </w:rPr>
-        <w:t>_memo_marginal</w:t>
-      </w:r>
-      <w:r>
-        <w:t xml:space="preserve"> que guarda el resultado la primera vez que se calcula para un conjunto de nodos y lo reutiliza en todas las llamadas siguientes. El cache se limpia al comenzar cada caso nuevo, por lo que no hay riesgo de mezclar resultados entre casos distintos.</w:t>
+        <w:t>_memo_perdida_final</w:t>
+      </w:r>
+      <w:r>
+        <w:t xml:space="preserve"> con clave canónica de la partición (independiente del orden en que se construyó). En las fases de convergencia del hill climbing, el hit rate típico supera el 70 %.</w:t>
       </w:r>
     </w:p>
     <w:p>
       <w:pPr>
         <w:pStyle w:val="Ttulo3"/>
       </w:pPr>
-      <w:bookmarkStart w:id="64" w:name="Xfb52e5d61cda7d94a5d25836b0471c5a2c43112"/>
-      <w:bookmarkStart w:id="65" w:name="_Toc232333659"/>
-      <w:bookmarkEnd w:id="62"/>
-      <w:r>
-        <w:t>C.2 Evaluación invariante en el loop de Queyranne (K2)</w:t>
-      </w:r>
-      <w:bookmarkEnd w:id="65"/>
-    </w:p>
-    <w:p>
-      <w:pPr>
-        <w:pStyle w:val="FirstParagraph"/>
-      </w:pPr>
-      <w:r>
-        <w:t xml:space="preserve">El algoritmo de Queyranne construye una secuencia eligiendo, paso a paso, el bloque de mayor ganancia marginal. La ganancia se calcula como </w:t>
-      </w:r>
-      <w:r>
-        <w:rPr>
-          <w:rStyle w:val="VerbatimChar"/>
-        </w:rPr>
-        <w:t>f(S ∪ a) − f(S)</w:t>
-      </w:r>
-      <w:r>
-        <w:t xml:space="preserve">. El valor </w:t>
-      </w:r>
-      <w:r>
-        <w:rPr>
-          <w:rStyle w:val="VerbatimChar"/>
-        </w:rPr>
-        <w:t>f(S)</w:t>
-      </w:r>
-      <w:r>
-        <w:t xml:space="preserve"> es constante dentro del loop que prueba todos los bloques candidatos </w:t>
-      </w:r>
-      <w:r>
-        <w:rPr>
-          <w:rStyle w:val="VerbatimChar"/>
-        </w:rPr>
-        <w:t>a</w:t>
-      </w:r>
-      <w:r>
-        <w:t>, pero antes se recomputaba para cada candidato.</w:t>
-      </w:r>
-    </w:p>
-    <w:p>
-      <w:pPr>
-        <w:pStyle w:val="Textoindependiente"/>
-      </w:pPr>
-      <w:r>
-        <w:t xml:space="preserve">Con este cambio, </w:t>
-      </w:r>
-      <w:r>
-        <w:rPr>
-          <w:rStyle w:val="VerbatimChar"/>
-        </w:rPr>
-        <w:t>f(S)</w:t>
-      </w:r>
-      <w:r>
-        <w:t xml:space="preserve"> se calcula una sola vez antes del loop interno. Para un subsistema de 15 nodos, esto elimina ~105 evaluaciones redundantes por fase.</w:t>
-      </w:r>
-    </w:p>
-    <w:p>
-      <w:pPr>
-        <w:pStyle w:val="Ttulo3"/>
-      </w:pPr>
-      <w:bookmarkStart w:id="66" w:name="c.3-cache-de-pérdida-final-k3"/>
-      <w:bookmarkStart w:id="67" w:name="_Toc232333660"/>
-      <w:bookmarkEnd w:id="64"/>
-      <w:r>
-        <w:t>C.3 Cache de pérdida final (K3)</w:t>
-      </w:r>
+      <w:bookmarkStart w:id="68" w:name="_Toc232333661"/>
+      <w:bookmarkStart w:id="69" w:name="Xb264e578f0d7ded816c568dc2b36045a2c644cd"/>
       <w:bookmarkEnd w:id="67"/>
-    </w:p>
-    <w:p>
-      <w:pPr>
-        <w:pStyle w:val="FirstParagraph"/>
-      </w:pPr>
-      <w:r>
-        <w:rPr>
-          <w:rStyle w:val="VerbatimChar"/>
-        </w:rPr>
-        <w:t>_calcular_perdida_final</w:t>
-      </w:r>
-      <w:r>
-        <w:t xml:space="preserve"> calcula la pérdida EMD de una k-partición completa. Se llama repetidamente en el refinamiento divisivo y en el hill climbing. En particular, cuando el hill climbing converge (ningún movimiento mejora), evalúa todas las combinaciones posibles sin encontrar ninguna mejor — la mayoría de esas particiones candidatas ya habían sido evaluadas en iteraciones anteriores.</w:t>
-      </w:r>
-    </w:p>
-    <w:p>
-      <w:pPr>
-        <w:pStyle w:val="Textoindependiente"/>
-      </w:pPr>
-      <w:r>
-        <w:t xml:space="preserve">Se añadió un diccionario </w:t>
-      </w:r>
-      <w:r>
-        <w:rPr>
-          <w:rStyle w:val="VerbatimChar"/>
-        </w:rPr>
-        <w:t>_memo_perdida_final</w:t>
-      </w:r>
-      <w:r>
-        <w:t xml:space="preserve"> con clave canónica de la partición (independiente del orden en que se construyó). En las fases de convergencia del hill climbing, el hit rate típico supera el 70 %.</w:t>
-      </w:r>
-    </w:p>
-    <w:p>
-      <w:pPr>
-        <w:pStyle w:val="Ttulo3"/>
-      </w:pPr>
-      <w:bookmarkStart w:id="68" w:name="Xb264e578f0d7ded816c568dc2b36045a2c644cd"/>
-      <w:bookmarkStart w:id="69" w:name="_Toc232333661"/>
-      <w:bookmarkEnd w:id="66"/>
       <w:r>
         <w:t>C.4 Script paralelo con kill-on-timeout (K4)</w:t>
       </w:r>
-      <w:bookmarkEnd w:id="69"/>
+      <w:bookmarkEnd w:id="68"/>
     </w:p>
     <w:p>
       <w:pPr>
@@ -8238,14 +8289,14 @@
       <w:pPr>
         <w:pStyle w:val="Ttulo3"/>
       </w:pPr>
-      <w:bookmarkStart w:id="70" w:name="X5c3380e3ef63ac5c6749aa5611b20ff091873fb"/>
-      <w:bookmarkStart w:id="71" w:name="_Toc232333662"/>
-      <w:bookmarkEnd w:id="68"/>
+      <w:bookmarkStart w:id="70" w:name="_Toc232333662"/>
+      <w:bookmarkStart w:id="71" w:name="X5c3380e3ef63ac5c6749aa5611b20ff091873fb"/>
+      <w:bookmarkEnd w:id="69"/>
       <w:r>
         <w:lastRenderedPageBreak/>
         <w:t>C.5 Limpieza: eliminación de la tabla de costos T (código muerto)</w:t>
       </w:r>
-      <w:bookmarkEnd w:id="71"/>
+      <w:bookmarkEnd w:id="70"/>
     </w:p>
     <w:p>
       <w:pPr>
@@ -8398,13 +8449,13 @@
       <w:pPr>
         <w:pStyle w:val="Ttulo3"/>
       </w:pPr>
-      <w:bookmarkStart w:id="72" w:name="X4eb4cc5e5fec983cfd6e6b17f89180266ba41ac"/>
-      <w:bookmarkStart w:id="73" w:name="_Toc232333663"/>
-      <w:bookmarkEnd w:id="70"/>
+      <w:bookmarkStart w:id="72" w:name="_Toc232333663"/>
+      <w:bookmarkStart w:id="73" w:name="X4eb4cc5e5fec983cfd6e6b17f89180266ba41ac"/>
+      <w:bookmarkEnd w:id="71"/>
       <w:r>
         <w:t>C.6 Estimado de tiempo (AMD 3020e, 2 núcleos, 1.2 GHz)</w:t>
       </w:r>
-      <w:bookmarkEnd w:id="73"/>
+      <w:bookmarkEnd w:id="72"/>
     </w:p>
     <w:tbl>
       <w:tblPr>
@@ -8774,8 +8825,8 @@
       <w:r>
         <w:t>Los casos con alcance parcial (no todos los nodos) terminan significativamente más rápido porque el tamaño efectivo del subsistema es menor.</w:t>
       </w:r>
-      <w:bookmarkEnd w:id="60"/>
-      <w:bookmarkEnd w:id="72"/>
+      <w:bookmarkEnd w:id="61"/>
+      <w:bookmarkEnd w:id="73"/>
     </w:p>
     <w:sectPr>
       <w:footnotePr>
@@ -10362,6 +10413,27 @@
       <w:ind w:left="440"/>
     </w:pPr>
   </w:style>
+  <w:style w:type="character" w:styleId="Mencinsinresolver">
+    <w:name w:val="Unresolved Mention"/>
+    <w:basedOn w:val="Fuentedeprrafopredeter"/>
+    <w:uiPriority w:val="99"/>
+    <w:semiHidden/>
+    <w:unhideWhenUsed/>
+    <w:rsid w:val="002A69C6"/>
+    <w:rPr>
+      <w:color w:val="605E5C"/>
+      <w:shd w:val="clear" w:color="auto" w:fill="E1DFDD"/>
+    </w:rPr>
+  </w:style>
+  <w:style w:type="character" w:styleId="Hipervnculovisitado">
+    <w:name w:val="FollowedHyperlink"/>
+    <w:basedOn w:val="Fuentedeprrafopredeter"/>
+    <w:rsid w:val="002A69C6"/>
+    <w:rPr>
+      <w:color w:val="96607D" w:themeColor="followedHyperlink"/>
+      <w:u w:val="single"/>
+    </w:rPr>
+  </w:style>
 </w:styles>
 </file>
 

</xml_diff>